<commit_message>
paper: manuscript v0.3 §5.1 — existence-probability and state-transition equations (5)–(12); doc 19 work log for 2026-10-10
- §5.1 (EN/KO): detection probability gated by view and range, Bayes updates and their log-odds form,
  steady-state detection share q*, state thresholds and transitions with miss counts, association gate,
  duplicate-suppression rule; loop-closure update renumbered to (13). Values from the 10-09 derivation of
  the memory code (P_D 0.08, c 0.01; marked [verify] for the runs of §7.2, which may predate 2026-09-19).
- build_docx.runs(): one level of nested sub/superscripts (T_{K_{i}←O_{i}}) now renders as a single subscript.
- 개별문서/19: today's sync incident and recovery, v0.3 changes, equations, 3080 repeat runs in progress.

Co-Authored-By: Claude Opus 5.5 <noreply@anthropic.com>
</commit_message>
<xml_diff>
--- a/paper_etrij_261003/etrij/ETRIJ_manuscript_v0.3.docx
+++ b/paper_etrij_261003/etrij/ETRIJ_manuscript_v0.3.docx
@@ -262,13 +262,13 @@
           <w:sz w:val="20"/>
           <w:vertAlign w:val="subscript"/>
         </w:rPr>
-        <w:t>K_{i</w:t>
-      </w:r>
-      <w:r>
-        <w:rPr>
-          <w:sz w:val="20"/>
-        </w:rPr>
-        <w:t>←O</w:t>
+        <w:t>Ki←Oi</w:t>
+      </w:r>
+      <w:r>
+        <w:rPr>
+          <w:sz w:val="20"/>
+        </w:rPr>
+        <w:t>, p</w:t>
       </w:r>
       <w:r>
         <w:rPr>
@@ -281,7 +281,7 @@
         <w:rPr>
           <w:sz w:val="20"/>
         </w:rPr>
-        <w:t>}, p</w:t>
+        <w:t>, C</w:t>
       </w:r>
       <w:r>
         <w:rPr>
@@ -294,46 +294,20 @@
         <w:rPr>
           <w:sz w:val="20"/>
         </w:rPr>
-        <w:t>, C</w:t>
+        <w:t>}. A loop closure updates only keyframe poses, re-sent as keyframe lists, so all objects follow the correction while T</w:t>
       </w:r>
       <w:r>
         <w:rPr>
           <w:sz w:val="20"/>
           <w:vertAlign w:val="subscript"/>
         </w:rPr>
-        <w:t>i</w:t>
-      </w:r>
-      <w:r>
-        <w:rPr>
-          <w:sz w:val="20"/>
-        </w:rPr>
-        <w:t>}. A loop closure updates only keyframe poses, re-sent as keyframe lists, so all objects follow the correction while T</w:t>
-      </w:r>
-      <w:r>
-        <w:rPr>
-          <w:sz w:val="20"/>
-          <w:vertAlign w:val="subscript"/>
-        </w:rPr>
-        <w:t>K_{i</w:t>
-      </w:r>
-      <w:r>
-        <w:rPr>
-          <w:sz w:val="20"/>
-        </w:rPr>
-        <w:t>←O</w:t>
-      </w:r>
-      <w:r>
-        <w:rPr>
-          <w:sz w:val="20"/>
-          <w:vertAlign w:val="subscript"/>
-        </w:rPr>
-        <w:t>i</w:t>
-      </w:r>
-      <w:r>
-        <w:rPr>
-          <w:sz w:val="20"/>
-        </w:rPr>
-        <w:t>} stays unchanged; existence probabilities keep objects through absences.</w:t>
+        <w:t>Ki←Oi</w:t>
+      </w:r>
+      <w:r>
+        <w:rPr>
+          <w:sz w:val="20"/>
+        </w:rPr>
+        <w:t xml:space="preserve"> stays unchanged; existence probabilities keep objects through absences.</w:t>
       </w:r>
     </w:p>
     <w:p>
@@ -932,13 +906,13 @@
           <w:sz w:val="20"/>
           <w:vertAlign w:val="subscript"/>
         </w:rPr>
-        <w:t>W←K_{ref</w:t>
-      </w:r>
-      <w:r>
-        <w:rPr>
-          <w:sz w:val="20"/>
-        </w:rPr>
-        <w:t>}), read in the tracking thread so that pose and reference keyframe refer to the same instant, and it sends the list of all live keyframes every 1 s, right after each map change, and again 0.5 s and 3 s later, because global bundle adjustment finishes seconds after the loop closure. A keyframe missing from a list is treated as culled.</w:t>
+        <w:t>W←Kref</w:t>
+      </w:r>
+      <w:r>
+        <w:rPr>
+          <w:sz w:val="20"/>
+        </w:rPr>
+        <w:t>), read in the tracking thread so that pose and reference keyframe refer to the same instant, and it sends the list of all live keyframes every 1 s, right after each map change, and again 0.5 s and 3 s later, because global bundle adjustment finishes seconds after the loop closure. A keyframe missing from a list is treated as culled.</w:t>
       </w:r>
     </w:p>
     <w:p>
@@ -1648,7 +1622,7 @@
           <w:sz w:val="20"/>
           <w:vertAlign w:val="subscript"/>
         </w:rPr>
-        <w:t>K_{i</w:t>
+        <w:t>Ki←Oi</w:t>
       </w:r>
       <w:r>
         <w:rPr>
@@ -1656,24 +1630,7 @@
           <w:i w:val="0"/>
           <w:sz w:val="20"/>
         </w:rPr>
-        <w:t>←O</w:t>
-      </w:r>
-      <w:r>
-        <w:rPr>
-          <w:rFonts w:ascii="Cambria Math" w:hAnsi="Cambria Math"/>
-          <w:i w:val="0"/>
-          <w:sz w:val="20"/>
-          <w:vertAlign w:val="subscript"/>
-        </w:rPr>
-        <w:t>i</w:t>
-      </w:r>
-      <w:r>
-        <w:rPr>
-          <w:rFonts w:ascii="Cambria Math" w:hAnsi="Cambria Math"/>
-          <w:i w:val="0"/>
-          <w:sz w:val="20"/>
-        </w:rPr>
-        <w:t>}, p</w:t>
+        <w:t>, p</w:t>
       </w:r>
       <w:r>
         <w:rPr>
@@ -1760,13 +1717,13 @@
           <w:sz w:val="20"/>
           <w:vertAlign w:val="subscript"/>
         </w:rPr>
-        <w:t>K_{i</w:t>
-      </w:r>
-      <w:r>
-        <w:rPr>
-          <w:sz w:val="20"/>
-        </w:rPr>
-        <w:t>←O</w:t>
+        <w:t>Ki←Oi</w:t>
+      </w:r>
+      <w:r>
+        <w:rPr>
+          <w:sz w:val="20"/>
+        </w:rPr>
+        <w:t>, existence probability p</w:t>
       </w:r>
       <w:r>
         <w:rPr>
@@ -1779,7 +1736,7 @@
         <w:rPr>
           <w:sz w:val="20"/>
         </w:rPr>
-        <w:t>}, existence probability p</w:t>
+        <w:t>, and class C</w:t>
       </w:r>
       <w:r>
         <w:rPr>
@@ -1792,7 +1749,7 @@
         <w:rPr>
           <w:sz w:val="20"/>
         </w:rPr>
-        <w:t>, and class C</w:t>
+        <w:t>, plus its observation count n</w:t>
       </w:r>
       <w:r>
         <w:rPr>
@@ -1805,7 +1762,7 @@
         <w:rPr>
           <w:sz w:val="20"/>
         </w:rPr>
-        <w:t>, plus its observation history. Its pose in the map frame is never stored; it is computed when needed as</w:t>
+        <w:t xml:space="preserve"> and history. Its pose in the map frame is never stored; it is computed when needed as</w:t>
       </w:r>
     </w:p>
     <w:p>
@@ -1841,7 +1798,7 @@
           <w:sz w:val="20"/>
           <w:vertAlign w:val="subscript"/>
         </w:rPr>
-        <w:t>W←O_{i</w:t>
+        <w:t>W←Oi</w:t>
       </w:r>
       <w:r>
         <w:rPr>
@@ -1849,7 +1806,7 @@
           <w:i w:val="0"/>
           <w:sz w:val="20"/>
         </w:rPr>
-        <w:t>} = T</w:t>
+        <w:t xml:space="preserve"> = T</w:t>
       </w:r>
       <w:r>
         <w:rPr>
@@ -1858,7 +1815,7 @@
           <w:sz w:val="20"/>
           <w:vertAlign w:val="subscript"/>
         </w:rPr>
-        <w:t>W←K_{i</w:t>
+        <w:t>W←Ki</w:t>
       </w:r>
       <w:r>
         <w:rPr>
@@ -1866,7 +1823,7 @@
           <w:i w:val="0"/>
           <w:sz w:val="20"/>
         </w:rPr>
-        <w:t>} · T</w:t>
+        <w:t xml:space="preserve"> · T</w:t>
       </w:r>
       <w:r>
         <w:rPr>
@@ -1875,32 +1832,7 @@
           <w:sz w:val="20"/>
           <w:vertAlign w:val="subscript"/>
         </w:rPr>
-        <w:t>K_{i</w:t>
-      </w:r>
-      <w:r>
-        <w:rPr>
-          <w:rFonts w:ascii="Cambria Math" w:hAnsi="Cambria Math"/>
-          <w:i w:val="0"/>
-          <w:sz w:val="20"/>
-        </w:rPr>
-        <w:t>←O</w:t>
-      </w:r>
-      <w:r>
-        <w:rPr>
-          <w:rFonts w:ascii="Cambria Math" w:hAnsi="Cambria Math"/>
-          <w:i w:val="0"/>
-          <w:sz w:val="20"/>
-          <w:vertAlign w:val="subscript"/>
-        </w:rPr>
-        <w:t>i</w:t>
-      </w:r>
-      <w:r>
-        <w:rPr>
-          <w:rFonts w:ascii="Cambria Math" w:hAnsi="Cambria Math"/>
-          <w:i w:val="0"/>
-          <w:sz w:val="20"/>
-        </w:rPr>
-        <w:t>}</w:t>
+        <w:t>Ki←Oi</w:t>
       </w:r>
       <w:r>
         <w:rPr>
@@ -1918,64 +1850,68 @@
       </w:pPr>
       <w:r>
         <w:rPr>
-          <w:sz w:val="20"/>
-        </w:rPr>
-        <w:t xml:space="preserve">A new observation is associated with an object of the same class within 0.15 m, nearest first and one-to-one per frame. Rotation is excluded from association because zero-shot estimators often return poses flipped by 180° for box-like objects. Position is the running mean of observations and orientation the mode of observations within 30°. The existence probability drives the states tentative (p = 0.7 at creation, hidden), active (≥ 2 observations and p &gt; 0.6), lost (p &lt; 0.3), remembered (p &lt; 0.05 with ≥ 5 observations), and deleted. A miss lowers p by Bayes' rule only if the object projects into the view </w:t>
-      </w:r>
-      <w:r>
-        <w:rPr>
-          <w:i/>
-          <w:sz w:val="20"/>
-        </w:rPr>
-        <w:t>and</w:t>
-      </w:r>
-      <w:r>
-        <w:rPr>
-          <w:sz w:val="20"/>
-        </w:rPr>
-        <w:t xml:space="preserve"> lies within the recognizer's detection range; lost and remembered objects stay association candidates, so a returning object regains its identifier. Of two same-class objects, one with five times fewer observations is hidden as a duplicate. On the office run, the map ends with eight active objects (14–29 observations each) and two hidden tentative ones.</w:t>
-      </w:r>
-    </w:p>
-    <w:p>
-      <w:pPr>
-        <w:keepNext/>
-        <w:spacing w:before="120" w:after="60" w:line="240" w:lineRule="auto"/>
-        <w:ind w:firstLine="0"/>
-        <w:jc w:val="left"/>
-      </w:pPr>
-      <w:r>
-        <w:rPr>
           <w:b/>
-          <w:i/>
-          <w:sz w:val="20"/>
-        </w:rPr>
-        <w:t>5.2 | Loop-closure-aware update</w:t>
-      </w:r>
-    </w:p>
-    <w:p>
-      <w:pPr>
-        <w:spacing w:before="0" w:after="0" w:line="240" w:lineRule="auto"/>
-        <w:ind w:firstLine="0"/>
-        <w:jc w:val="both"/>
-      </w:pPr>
-      <w:r>
-        <w:rPr>
-          <w:sz w:val="20"/>
-        </w:rPr>
-        <w:t>When SLAM corrects its keyframes (Fig. 1, panel 6), the next keyframe list carries the corrected poses T′</w:t>
+          <w:sz w:val="20"/>
+        </w:rPr>
+        <w:t>Existence probability.</w:t>
+      </w:r>
+      <w:r>
+        <w:rPr>
+          <w:sz w:val="20"/>
+        </w:rPr>
+        <w:t xml:space="preserve"> Let p</w:t>
       </w:r>
       <w:r>
         <w:rPr>
           <w:sz w:val="20"/>
           <w:vertAlign w:val="subscript"/>
         </w:rPr>
-        <w:t>W←K_{i</w:t>
-      </w:r>
-      <w:r>
-        <w:rPr>
-          <w:sz w:val="20"/>
-        </w:rPr>
-        <w:t>}, and every object is updated by</w:t>
+        <w:t>i,k</w:t>
+      </w:r>
+      <w:r>
+        <w:rPr>
+          <w:sz w:val="20"/>
+        </w:rPr>
+        <w:t xml:space="preserve"> be the probability that object i exists after recognition frame k and ℓ</w:t>
+      </w:r>
+      <w:r>
+        <w:rPr>
+          <w:sz w:val="20"/>
+          <w:vertAlign w:val="subscript"/>
+        </w:rPr>
+        <w:t>i,k</w:t>
+      </w:r>
+      <w:r>
+        <w:rPr>
+          <w:sz w:val="20"/>
+        </w:rPr>
+        <w:t xml:space="preserve"> = ln(p</w:t>
+      </w:r>
+      <w:r>
+        <w:rPr>
+          <w:sz w:val="20"/>
+          <w:vertAlign w:val="subscript"/>
+        </w:rPr>
+        <w:t>i,k</w:t>
+      </w:r>
+      <w:r>
+        <w:rPr>
+          <w:sz w:val="20"/>
+        </w:rPr>
+        <w:t xml:space="preserve"> / (1 − p</w:t>
+      </w:r>
+      <w:r>
+        <w:rPr>
+          <w:sz w:val="20"/>
+          <w:vertAlign w:val="subscript"/>
+        </w:rPr>
+        <w:t>i,k</w:t>
+      </w:r>
+      <w:r>
+        <w:rPr>
+          <w:sz w:val="20"/>
+        </w:rPr>
+        <w:t>)) its log-odds. A miss is evidence only if the object could have been detected. With the object center at (x, y, z) in the recognition camera at capture time and (u, v) its projection, the detection probability of frame k is</w:t>
       </w:r>
     </w:p>
     <w:p>
@@ -2002,7 +1938,7 @@
           <w:i w:val="0"/>
           <w:sz w:val="20"/>
         </w:rPr>
-        <w:t>T′</w:t>
+        <w:t>P</w:t>
       </w:r>
       <w:r>
         <w:rPr>
@@ -2011,7 +1947,7 @@
           <w:sz w:val="20"/>
           <w:vertAlign w:val="subscript"/>
         </w:rPr>
-        <w:t>W←O_{i</w:t>
+        <w:t>D,k</w:t>
       </w:r>
       <w:r>
         <w:rPr>
@@ -2019,7 +1955,7 @@
           <w:i w:val="0"/>
           <w:sz w:val="20"/>
         </w:rPr>
-        <w:t>} = T′</w:t>
+        <w:t xml:space="preserve"> = P</w:t>
       </w:r>
       <w:r>
         <w:rPr>
@@ -2028,7 +1964,7 @@
           <w:sz w:val="20"/>
           <w:vertAlign w:val="subscript"/>
         </w:rPr>
-        <w:t>W←K_{i</w:t>
+        <w:t>D</w:t>
       </w:r>
       <w:r>
         <w:rPr>
@@ -2036,7 +1972,7 @@
           <w:i w:val="0"/>
           <w:sz w:val="20"/>
         </w:rPr>
-        <w:t>} · T</w:t>
+        <w:t xml:space="preserve"> · 𝟙[0 &lt; z ≤ z</w:t>
       </w:r>
       <w:r>
         <w:rPr>
@@ -2045,7 +1981,7 @@
           <w:sz w:val="20"/>
           <w:vertAlign w:val="subscript"/>
         </w:rPr>
-        <w:t>K_{i</w:t>
+        <w:t>max</w:t>
       </w:r>
       <w:r>
         <w:rPr>
@@ -2053,24 +1989,7 @@
           <w:i w:val="0"/>
           <w:sz w:val="20"/>
         </w:rPr>
-        <w:t>←O</w:t>
-      </w:r>
-      <w:r>
-        <w:rPr>
-          <w:rFonts w:ascii="Cambria Math" w:hAnsi="Cambria Math"/>
-          <w:i w:val="0"/>
-          <w:sz w:val="20"/>
-          <w:vertAlign w:val="subscript"/>
-        </w:rPr>
-        <w:t>i</w:t>
-      </w:r>
-      <w:r>
-        <w:rPr>
-          <w:rFonts w:ascii="Cambria Math" w:hAnsi="Cambria Math"/>
-          <w:i w:val="0"/>
-          <w:sz w:val="20"/>
-        </w:rPr>
-        <w:t>}</w:t>
+        <w:t>] · 𝟙[(u, v) ∈ Ω]</w:t>
       </w:r>
       <w:r>
         <w:rPr>
@@ -2090,6 +2009,936 @@
         <w:rPr>
           <w:sz w:val="20"/>
         </w:rPr>
+        <w:t>where P</w:t>
+      </w:r>
+      <w:r>
+        <w:rPr>
+          <w:sz w:val="20"/>
+          <w:vertAlign w:val="subscript"/>
+        </w:rPr>
+        <w:t>D</w:t>
+      </w:r>
+      <w:r>
+        <w:rPr>
+          <w:sz w:val="20"/>
+        </w:rPr>
+        <w:t xml:space="preserve"> is the per-frame detection rate of a visible object, z</w:t>
+      </w:r>
+      <w:r>
+        <w:rPr>
+          <w:sz w:val="20"/>
+          <w:vertAlign w:val="subscript"/>
+        </w:rPr>
+        <w:t>max</w:t>
+      </w:r>
+      <w:r>
+        <w:rPr>
+          <w:sz w:val="20"/>
+        </w:rPr>
+        <w:t xml:space="preserve"> = 1.5 m the detection range of the recognizer, and Ω the image without a 5% margin. If the object exists, it is detected with probability P</w:t>
+      </w:r>
+      <w:r>
+        <w:rPr>
+          <w:sz w:val="20"/>
+          <w:vertAlign w:val="subscript"/>
+        </w:rPr>
+        <w:t>D,k</w:t>
+      </w:r>
+      <w:r>
+        <w:rPr>
+          <w:sz w:val="20"/>
+        </w:rPr>
+        <w:t>; if it does not, an associated detection has relative likelihood c. Bayes' rule then gives, for a detected and for a missed object,</w:t>
+      </w:r>
+    </w:p>
+    <w:p>
+      <w:pPr>
+        <w:tabs>
+          <w:tab w:pos="2324" w:val="center"/>
+          <w:tab w:pos="4649" w:val="right"/>
+        </w:tabs>
+        <w:spacing w:before="60" w:after="60" w:line="240" w:lineRule="auto"/>
+        <w:ind w:firstLine="0"/>
+        <w:jc w:val="left"/>
+      </w:pPr>
+      <w:r>
+        <w:rPr>
+          <w:rFonts w:ascii="Cambria Math" w:hAnsi="Cambria Math"/>
+          <w:i w:val="0"/>
+          <w:sz w:val="20"/>
+        </w:rPr>
+        <w:tab/>
+      </w:r>
+      <w:r>
+        <w:rPr>
+          <w:rFonts w:ascii="Cambria Math" w:hAnsi="Cambria Math"/>
+          <w:i w:val="0"/>
+          <w:sz w:val="20"/>
+        </w:rPr>
+        <w:t>p′ = p P</w:t>
+      </w:r>
+      <w:r>
+        <w:rPr>
+          <w:rFonts w:ascii="Cambria Math" w:hAnsi="Cambria Math"/>
+          <w:i w:val="0"/>
+          <w:sz w:val="20"/>
+          <w:vertAlign w:val="subscript"/>
+        </w:rPr>
+        <w:t>D</w:t>
+      </w:r>
+      <w:r>
+        <w:rPr>
+          <w:rFonts w:ascii="Cambria Math" w:hAnsi="Cambria Math"/>
+          <w:i w:val="0"/>
+          <w:sz w:val="20"/>
+        </w:rPr>
+        <w:t xml:space="preserve"> / ( p P</w:t>
+      </w:r>
+      <w:r>
+        <w:rPr>
+          <w:rFonts w:ascii="Cambria Math" w:hAnsi="Cambria Math"/>
+          <w:i w:val="0"/>
+          <w:sz w:val="20"/>
+          <w:vertAlign w:val="subscript"/>
+        </w:rPr>
+        <w:t>D</w:t>
+      </w:r>
+      <w:r>
+        <w:rPr>
+          <w:rFonts w:ascii="Cambria Math" w:hAnsi="Cambria Math"/>
+          <w:i w:val="0"/>
+          <w:sz w:val="20"/>
+        </w:rPr>
+        <w:t xml:space="preserve"> + (1 − p) c )</w:t>
+      </w:r>
+      <w:r>
+        <w:rPr>
+          <w:sz w:val="20"/>
+        </w:rPr>
+        <w:tab/>
+        <w:t>(6)</w:t>
+      </w:r>
+    </w:p>
+    <w:p>
+      <w:pPr>
+        <w:tabs>
+          <w:tab w:pos="2324" w:val="center"/>
+          <w:tab w:pos="4649" w:val="right"/>
+        </w:tabs>
+        <w:spacing w:before="60" w:after="60" w:line="240" w:lineRule="auto"/>
+        <w:ind w:firstLine="0"/>
+        <w:jc w:val="left"/>
+      </w:pPr>
+      <w:r>
+        <w:rPr>
+          <w:rFonts w:ascii="Cambria Math" w:hAnsi="Cambria Math"/>
+          <w:i w:val="0"/>
+          <w:sz w:val="20"/>
+        </w:rPr>
+        <w:tab/>
+      </w:r>
+      <w:r>
+        <w:rPr>
+          <w:rFonts w:ascii="Cambria Math" w:hAnsi="Cambria Math"/>
+          <w:i w:val="0"/>
+          <w:sz w:val="20"/>
+        </w:rPr>
+        <w:t>p′ = p (1 − P</w:t>
+      </w:r>
+      <w:r>
+        <w:rPr>
+          <w:rFonts w:ascii="Cambria Math" w:hAnsi="Cambria Math"/>
+          <w:i w:val="0"/>
+          <w:sz w:val="20"/>
+          <w:vertAlign w:val="subscript"/>
+        </w:rPr>
+        <w:t>D,k</w:t>
+      </w:r>
+      <w:r>
+        <w:rPr>
+          <w:rFonts w:ascii="Cambria Math" w:hAnsi="Cambria Math"/>
+          <w:i w:val="0"/>
+          <w:sz w:val="20"/>
+        </w:rPr>
+        <w:t>) / ( 1 − p P</w:t>
+      </w:r>
+      <w:r>
+        <w:rPr>
+          <w:rFonts w:ascii="Cambria Math" w:hAnsi="Cambria Math"/>
+          <w:i w:val="0"/>
+          <w:sz w:val="20"/>
+          <w:vertAlign w:val="subscript"/>
+        </w:rPr>
+        <w:t>D,k</w:t>
+      </w:r>
+      <w:r>
+        <w:rPr>
+          <w:rFonts w:ascii="Cambria Math" w:hAnsi="Cambria Math"/>
+          <w:i w:val="0"/>
+          <w:sz w:val="20"/>
+        </w:rPr>
+        <w:t xml:space="preserve"> )</w:t>
+      </w:r>
+      <w:r>
+        <w:rPr>
+          <w:sz w:val="20"/>
+        </w:rPr>
+        <w:tab/>
+        <w:t>(7)</w:t>
+      </w:r>
+    </w:p>
+    <w:p>
+      <w:pPr>
+        <w:spacing w:before="0" w:after="0" w:line="240" w:lineRule="auto"/>
+        <w:ind w:firstLine="0"/>
+        <w:jc w:val="both"/>
+      </w:pPr>
+      <w:r>
+        <w:rPr>
+          <w:sz w:val="20"/>
+        </w:rPr>
+        <w:t>Since 1 − p′ = (1 − p) / (1 − p P</w:t>
+      </w:r>
+      <w:r>
+        <w:rPr>
+          <w:sz w:val="20"/>
+          <w:vertAlign w:val="subscript"/>
+        </w:rPr>
+        <w:t>D,k</w:t>
+      </w:r>
+      <w:r>
+        <w:rPr>
+          <w:sz w:val="20"/>
+        </w:rPr>
+        <w:t>) in (7), both updates multiply the odds, and in log-odds they add:</w:t>
+      </w:r>
+    </w:p>
+    <w:p>
+      <w:pPr>
+        <w:tabs>
+          <w:tab w:pos="2324" w:val="center"/>
+          <w:tab w:pos="4649" w:val="right"/>
+        </w:tabs>
+        <w:spacing w:before="60" w:after="60" w:line="240" w:lineRule="auto"/>
+        <w:ind w:firstLine="0"/>
+        <w:jc w:val="left"/>
+      </w:pPr>
+      <w:r>
+        <w:rPr>
+          <w:rFonts w:ascii="Cambria Math" w:hAnsi="Cambria Math"/>
+          <w:i w:val="0"/>
+          <w:sz w:val="20"/>
+        </w:rPr>
+        <w:tab/>
+      </w:r>
+      <w:r>
+        <w:rPr>
+          <w:rFonts w:ascii="Cambria Math" w:hAnsi="Cambria Math"/>
+          <w:i w:val="0"/>
+          <w:sz w:val="20"/>
+        </w:rPr>
+        <w:t>ℓ′ = ℓ + ln(P</w:t>
+      </w:r>
+      <w:r>
+        <w:rPr>
+          <w:rFonts w:ascii="Cambria Math" w:hAnsi="Cambria Math"/>
+          <w:i w:val="0"/>
+          <w:sz w:val="20"/>
+          <w:vertAlign w:val="subscript"/>
+        </w:rPr>
+        <w:t>D</w:t>
+      </w:r>
+      <w:r>
+        <w:rPr>
+          <w:rFonts w:ascii="Cambria Math" w:hAnsi="Cambria Math"/>
+          <w:i w:val="0"/>
+          <w:sz w:val="20"/>
+        </w:rPr>
+        <w:t xml:space="preserve"> / c)   (detected)</w:t>
+      </w:r>
+      <w:r>
+        <w:rPr>
+          <w:sz w:val="20"/>
+        </w:rPr>
+        <w:tab/>
+        <w:t>(8)</w:t>
+      </w:r>
+    </w:p>
+    <w:p>
+      <w:pPr>
+        <w:tabs>
+          <w:tab w:pos="2324" w:val="center"/>
+          <w:tab w:pos="4649" w:val="right"/>
+        </w:tabs>
+        <w:spacing w:before="60" w:after="60" w:line="240" w:lineRule="auto"/>
+        <w:ind w:firstLine="0"/>
+        <w:jc w:val="left"/>
+      </w:pPr>
+      <w:r>
+        <w:rPr>
+          <w:rFonts w:ascii="Cambria Math" w:hAnsi="Cambria Math"/>
+          <w:i w:val="0"/>
+          <w:sz w:val="20"/>
+        </w:rPr>
+        <w:tab/>
+      </w:r>
+      <w:r>
+        <w:rPr>
+          <w:rFonts w:ascii="Cambria Math" w:hAnsi="Cambria Math"/>
+          <w:i w:val="0"/>
+          <w:sz w:val="20"/>
+        </w:rPr>
+        <w:t>ℓ′ = ℓ + ln(1 − P</w:t>
+      </w:r>
+      <w:r>
+        <w:rPr>
+          <w:rFonts w:ascii="Cambria Math" w:hAnsi="Cambria Math"/>
+          <w:i w:val="0"/>
+          <w:sz w:val="20"/>
+          <w:vertAlign w:val="subscript"/>
+        </w:rPr>
+        <w:t>D,k</w:t>
+      </w:r>
+      <w:r>
+        <w:rPr>
+          <w:rFonts w:ascii="Cambria Math" w:hAnsi="Cambria Math"/>
+          <w:i w:val="0"/>
+          <w:sz w:val="20"/>
+        </w:rPr>
+        <w:t>)   (missed)</w:t>
+      </w:r>
+      <w:r>
+        <w:rPr>
+          <w:sz w:val="20"/>
+        </w:rPr>
+        <w:tab/>
+        <w:t>(9)</w:t>
+      </w:r>
+    </w:p>
+    <w:p>
+      <w:pPr>
+        <w:spacing w:before="0" w:after="0" w:line="240" w:lineRule="auto"/>
+        <w:ind w:firstLine="0"/>
+        <w:jc w:val="both"/>
+      </w:pPr>
+      <w:r>
+        <w:rPr>
+          <w:sz w:val="20"/>
+        </w:rPr>
+        <w:t>with ℓ ≤ ln 99. With P</w:t>
+      </w:r>
+      <w:r>
+        <w:rPr>
+          <w:sz w:val="20"/>
+          <w:vertAlign w:val="subscript"/>
+        </w:rPr>
+        <w:t>D</w:t>
+      </w:r>
+      <w:r>
+        <w:rPr>
+          <w:sz w:val="20"/>
+        </w:rPr>
+        <w:t xml:space="preserve"> = 0.08 and c = 0.01 [verify for the runs of Section 7.2], a detection adds 2.079 and a visible miss subtracts 0.083. Out of view or range P</w:t>
+      </w:r>
+      <w:r>
+        <w:rPr>
+          <w:sz w:val="20"/>
+          <w:vertAlign w:val="subscript"/>
+        </w:rPr>
+        <w:t>D,k</w:t>
+      </w:r>
+      <w:r>
+        <w:rPr>
+          <w:sz w:val="20"/>
+        </w:rPr>
+        <w:t xml:space="preserve"> = 0 and ℓ does not change, so an object that is not seen is never forgotten. If an object is detected in a share q of the frames in which it is visible, its expected log-odds does not decrease when q ≥ q*, with</w:t>
+      </w:r>
+    </w:p>
+    <w:p>
+      <w:pPr>
+        <w:tabs>
+          <w:tab w:pos="2324" w:val="center"/>
+          <w:tab w:pos="4649" w:val="right"/>
+        </w:tabs>
+        <w:spacing w:before="60" w:after="60" w:line="240" w:lineRule="auto"/>
+        <w:ind w:firstLine="0"/>
+        <w:jc w:val="left"/>
+      </w:pPr>
+      <w:r>
+        <w:rPr>
+          <w:rFonts w:ascii="Cambria Math" w:hAnsi="Cambria Math"/>
+          <w:i w:val="0"/>
+          <w:sz w:val="20"/>
+        </w:rPr>
+        <w:tab/>
+      </w:r>
+      <w:r>
+        <w:rPr>
+          <w:rFonts w:ascii="Cambria Math" w:hAnsi="Cambria Math"/>
+          <w:i w:val="0"/>
+          <w:sz w:val="20"/>
+        </w:rPr>
+        <w:t>q* = −ln(1 − P</w:t>
+      </w:r>
+      <w:r>
+        <w:rPr>
+          <w:rFonts w:ascii="Cambria Math" w:hAnsi="Cambria Math"/>
+          <w:i w:val="0"/>
+          <w:sz w:val="20"/>
+          <w:vertAlign w:val="subscript"/>
+        </w:rPr>
+        <w:t>D</w:t>
+      </w:r>
+      <w:r>
+        <w:rPr>
+          <w:rFonts w:ascii="Cambria Math" w:hAnsi="Cambria Math"/>
+          <w:i w:val="0"/>
+          <w:sz w:val="20"/>
+        </w:rPr>
+        <w:t>) / ln[P</w:t>
+      </w:r>
+      <w:r>
+        <w:rPr>
+          <w:rFonts w:ascii="Cambria Math" w:hAnsi="Cambria Math"/>
+          <w:i w:val="0"/>
+          <w:sz w:val="20"/>
+          <w:vertAlign w:val="subscript"/>
+        </w:rPr>
+        <w:t>D</w:t>
+      </w:r>
+      <w:r>
+        <w:rPr>
+          <w:rFonts w:ascii="Cambria Math" w:hAnsi="Cambria Math"/>
+          <w:i w:val="0"/>
+          <w:sz w:val="20"/>
+        </w:rPr>
+        <w:t xml:space="preserve"> / (c(1 − P</w:t>
+      </w:r>
+      <w:r>
+        <w:rPr>
+          <w:rFonts w:ascii="Cambria Math" w:hAnsi="Cambria Math"/>
+          <w:i w:val="0"/>
+          <w:sz w:val="20"/>
+          <w:vertAlign w:val="subscript"/>
+        </w:rPr>
+        <w:t>D</w:t>
+      </w:r>
+      <w:r>
+        <w:rPr>
+          <w:rFonts w:ascii="Cambria Math" w:hAnsi="Cambria Math"/>
+          <w:i w:val="0"/>
+          <w:sz w:val="20"/>
+        </w:rPr>
+        <w:t>))]</w:t>
+      </w:r>
+      <w:r>
+        <w:rPr>
+          <w:sz w:val="20"/>
+        </w:rPr>
+        <w:tab/>
+        <w:t>(10)</w:t>
+      </w:r>
+    </w:p>
+    <w:p>
+      <w:pPr>
+        <w:spacing w:before="0" w:after="0" w:line="240" w:lineRule="auto"/>
+        <w:ind w:firstLine="0"/>
+        <w:jc w:val="both"/>
+      </w:pPr>
+      <w:r>
+        <w:rPr>
+          <w:sz w:val="20"/>
+        </w:rPr>
+        <w:t>which is 3.86% for these values, below the per-frame detection rates we measure [verify].</w:t>
+      </w:r>
+    </w:p>
+    <w:p>
+      <w:pPr>
+        <w:spacing w:before="0" w:after="0" w:line="240" w:lineRule="auto"/>
+        <w:ind w:firstLine="227"/>
+        <w:jc w:val="both"/>
+      </w:pPr>
+      <w:r>
+        <w:rPr>
+          <w:b/>
+          <w:sz w:val="20"/>
+        </w:rPr>
+        <w:t>States.</w:t>
+      </w:r>
+      <w:r>
+        <w:rPr>
+          <w:sz w:val="20"/>
+        </w:rPr>
+        <w:t xml:space="preserve"> The state s</w:t>
+      </w:r>
+      <w:r>
+        <w:rPr>
+          <w:sz w:val="20"/>
+          <w:vertAlign w:val="subscript"/>
+        </w:rPr>
+        <w:t>i</w:t>
+      </w:r>
+      <w:r>
+        <w:rPr>
+          <w:sz w:val="20"/>
+        </w:rPr>
+        <w:t xml:space="preserve"> ∈ {tentative T, active A, lost L, remembered M, deleted D} changes when p</w:t>
+      </w:r>
+      <w:r>
+        <w:rPr>
+          <w:sz w:val="20"/>
+          <w:vertAlign w:val="subscript"/>
+        </w:rPr>
+        <w:t>i</w:t>
+      </w:r>
+      <w:r>
+        <w:rPr>
+          <w:sz w:val="20"/>
+        </w:rPr>
+        <w:t xml:space="preserve"> crosses fixed thresholds, after association and update in every frame. An unassociated observation creates an object with s = T, p = 0.7 (ℓ = 0.847), and n = 1. Then T → A if n ≥ 2 and p &gt; 0.6; A → L if p &lt; 0.3; L → M if p &lt; 0.05 and n ≥ 5, after which misses are ignored; L → D if p &lt; 0.05 and n &lt; 5; T → D if p &lt; 0.05 or 100 frames after creation; and L or M → A on redetection. By (8) and (9), consecutive visible misses delete a tentative object after 46 frames, make a just-promoted active object (p = 0.949) lost after 46 and a saturated one (p = 0.99) after 66, and retire a lost object after 26; three detections restore the cap. A second detection promotes a tentative object if at most 30 visible misses lie between the two.</w:t>
+      </w:r>
+    </w:p>
+    <w:p>
+      <w:pPr>
+        <w:spacing w:before="0" w:after="0" w:line="240" w:lineRule="auto"/>
+        <w:ind w:firstLine="227"/>
+        <w:jc w:val="both"/>
+      </w:pPr>
+      <w:r>
+        <w:rPr>
+          <w:b/>
+          <w:sz w:val="20"/>
+        </w:rPr>
+        <w:t>Association, fusion, and display.</w:t>
+      </w:r>
+      <w:r>
+        <w:rPr>
+          <w:sz w:val="20"/>
+        </w:rPr>
+        <w:t xml:space="preserve"> An observation z of class C</w:t>
+      </w:r>
+      <w:r>
+        <w:rPr>
+          <w:sz w:val="20"/>
+          <w:vertAlign w:val="subscript"/>
+        </w:rPr>
+        <w:t>i</w:t>
+      </w:r>
+      <w:r>
+        <w:rPr>
+          <w:sz w:val="20"/>
+        </w:rPr>
+        <w:t xml:space="preserve"> is associated with object i if</w:t>
+      </w:r>
+    </w:p>
+    <w:p>
+      <w:pPr>
+        <w:tabs>
+          <w:tab w:pos="2324" w:val="center"/>
+          <w:tab w:pos="4649" w:val="right"/>
+        </w:tabs>
+        <w:spacing w:before="60" w:after="60" w:line="240" w:lineRule="auto"/>
+        <w:ind w:firstLine="0"/>
+        <w:jc w:val="left"/>
+      </w:pPr>
+      <w:r>
+        <w:rPr>
+          <w:rFonts w:ascii="Cambria Math" w:hAnsi="Cambria Math"/>
+          <w:i w:val="0"/>
+          <w:sz w:val="20"/>
+        </w:rPr>
+        <w:tab/>
+      </w:r>
+      <w:r>
+        <w:rPr>
+          <w:rFonts w:ascii="Cambria Math" w:hAnsi="Cambria Math"/>
+          <w:i w:val="0"/>
+          <w:sz w:val="20"/>
+        </w:rPr>
+        <w:t>‖ t</w:t>
+      </w:r>
+      <w:r>
+        <w:rPr>
+          <w:rFonts w:ascii="Cambria Math" w:hAnsi="Cambria Math"/>
+          <w:i w:val="0"/>
+          <w:sz w:val="20"/>
+          <w:vertAlign w:val="subscript"/>
+        </w:rPr>
+        <w:t>W←Oi</w:t>
+      </w:r>
+      <w:r>
+        <w:rPr>
+          <w:rFonts w:ascii="Cambria Math" w:hAnsi="Cambria Math"/>
+          <w:i w:val="0"/>
+          <w:sz w:val="20"/>
+        </w:rPr>
+        <w:t xml:space="preserve"> − t</w:t>
+      </w:r>
+      <w:r>
+        <w:rPr>
+          <w:rFonts w:ascii="Cambria Math" w:hAnsi="Cambria Math"/>
+          <w:i w:val="0"/>
+          <w:sz w:val="20"/>
+          <w:vertAlign w:val="subscript"/>
+        </w:rPr>
+        <w:t>z</w:t>
+      </w:r>
+      <w:r>
+        <w:rPr>
+          <w:rFonts w:ascii="Cambria Math" w:hAnsi="Cambria Math"/>
+          <w:i w:val="0"/>
+          <w:sz w:val="20"/>
+        </w:rPr>
+        <w:t xml:space="preserve"> ‖ ≤ g · m(s</w:t>
+      </w:r>
+      <w:r>
+        <w:rPr>
+          <w:rFonts w:ascii="Cambria Math" w:hAnsi="Cambria Math"/>
+          <w:i w:val="0"/>
+          <w:sz w:val="20"/>
+          <w:vertAlign w:val="subscript"/>
+        </w:rPr>
+        <w:t>i</w:t>
+      </w:r>
+      <w:r>
+        <w:rPr>
+          <w:rFonts w:ascii="Cambria Math" w:hAnsi="Cambria Math"/>
+          <w:i w:val="0"/>
+          <w:sz w:val="20"/>
+        </w:rPr>
+        <w:t>)</w:t>
+      </w:r>
+      <w:r>
+        <w:rPr>
+          <w:sz w:val="20"/>
+        </w:rPr>
+        <w:tab/>
+        <w:t>(11)</w:t>
+      </w:r>
+    </w:p>
+    <w:p>
+      <w:pPr>
+        <w:spacing w:before="0" w:after="0" w:line="240" w:lineRule="auto"/>
+        <w:ind w:firstLine="0"/>
+        <w:jc w:val="both"/>
+      </w:pPr>
+      <w:r>
+        <w:rPr>
+          <w:sz w:val="20"/>
+        </w:rPr>
+        <w:t>with g = 0.15 m, m(T) = 3, and m = 1 otherwise; pairs are assigned greedily one-to-one in order of distance. Rotation is excluded because zero-shot estimators often return poses flipped by 180° for box-like objects. Position is the running mean t</w:t>
+      </w:r>
+      <w:r>
+        <w:rPr>
+          <w:sz w:val="20"/>
+          <w:vertAlign w:val="subscript"/>
+        </w:rPr>
+        <w:t>n</w:t>
+      </w:r>
+      <w:r>
+        <w:rPr>
+          <w:sz w:val="20"/>
+        </w:rPr>
+        <w:t xml:space="preserve"> = t</w:t>
+      </w:r>
+      <w:r>
+        <w:rPr>
+          <w:sz w:val="20"/>
+          <w:vertAlign w:val="subscript"/>
+        </w:rPr>
+        <w:t>n−1</w:t>
+      </w:r>
+      <w:r>
+        <w:rPr>
+          <w:sz w:val="20"/>
+        </w:rPr>
+        <w:t xml:space="preserve"> + (t</w:t>
+      </w:r>
+      <w:r>
+        <w:rPr>
+          <w:sz w:val="20"/>
+          <w:vertAlign w:val="subscript"/>
+        </w:rPr>
+        <w:t>z</w:t>
+      </w:r>
+      <w:r>
+        <w:rPr>
+          <w:sz w:val="20"/>
+        </w:rPr>
+        <w:t xml:space="preserve"> − t</w:t>
+      </w:r>
+      <w:r>
+        <w:rPr>
+          <w:sz w:val="20"/>
+          <w:vertAlign w:val="subscript"/>
+        </w:rPr>
+        <w:t>n−1</w:t>
+      </w:r>
+      <w:r>
+        <w:rPr>
+          <w:sz w:val="20"/>
+        </w:rPr>
+        <w:t>) / n, and orientation the mode of observations within 30° (at most eight modes, symmetric objects aligned first). Lost and remembered objects stay association candidates, so a returning object regains its identifier. An object is displayed only if s</w:t>
+      </w:r>
+      <w:r>
+        <w:rPr>
+          <w:sz w:val="20"/>
+          <w:vertAlign w:val="subscript"/>
+        </w:rPr>
+        <w:t>i</w:t>
+      </w:r>
+      <w:r>
+        <w:rPr>
+          <w:sz w:val="20"/>
+        </w:rPr>
+        <w:t xml:space="preserve"> ∈ {A, L, M} and</w:t>
+      </w:r>
+    </w:p>
+    <w:p>
+      <w:pPr>
+        <w:tabs>
+          <w:tab w:pos="2324" w:val="center"/>
+          <w:tab w:pos="4649" w:val="right"/>
+        </w:tabs>
+        <w:spacing w:before="60" w:after="60" w:line="240" w:lineRule="auto"/>
+        <w:ind w:firstLine="0"/>
+        <w:jc w:val="left"/>
+      </w:pPr>
+      <w:r>
+        <w:rPr>
+          <w:rFonts w:ascii="Cambria Math" w:hAnsi="Cambria Math"/>
+          <w:i w:val="0"/>
+          <w:sz w:val="20"/>
+        </w:rPr>
+        <w:tab/>
+      </w:r>
+      <w:r>
+        <w:rPr>
+          <w:rFonts w:ascii="Cambria Math" w:hAnsi="Cambria Math"/>
+          <w:i w:val="0"/>
+          <w:sz w:val="20"/>
+        </w:rPr>
+        <w:t>ρ · n</w:t>
+      </w:r>
+      <w:r>
+        <w:rPr>
+          <w:rFonts w:ascii="Cambria Math" w:hAnsi="Cambria Math"/>
+          <w:i w:val="0"/>
+          <w:sz w:val="20"/>
+          <w:vertAlign w:val="subscript"/>
+        </w:rPr>
+        <w:t>i</w:t>
+      </w:r>
+      <w:r>
+        <w:rPr>
+          <w:rFonts w:ascii="Cambria Math" w:hAnsi="Cambria Math"/>
+          <w:i w:val="0"/>
+          <w:sz w:val="20"/>
+        </w:rPr>
+        <w:t xml:space="preserve"> ≥ max</w:t>
+      </w:r>
+      <w:r>
+        <w:rPr>
+          <w:rFonts w:ascii="Cambria Math" w:hAnsi="Cambria Math"/>
+          <w:i w:val="0"/>
+          <w:sz w:val="20"/>
+          <w:vertAlign w:val="subscript"/>
+        </w:rPr>
+        <w:t>j ∈ 𝒮i</w:t>
+      </w:r>
+      <w:r>
+        <w:rPr>
+          <w:rFonts w:ascii="Cambria Math" w:hAnsi="Cambria Math"/>
+          <w:i w:val="0"/>
+          <w:sz w:val="20"/>
+        </w:rPr>
+        <w:t xml:space="preserve"> n</w:t>
+      </w:r>
+      <w:r>
+        <w:rPr>
+          <w:rFonts w:ascii="Cambria Math" w:hAnsi="Cambria Math"/>
+          <w:i w:val="0"/>
+          <w:sz w:val="20"/>
+          <w:vertAlign w:val="subscript"/>
+        </w:rPr>
+        <w:t>j</w:t>
+      </w:r>
+      <w:r>
+        <w:rPr>
+          <w:sz w:val="20"/>
+        </w:rPr>
+        <w:tab/>
+        <w:t>(12)</w:t>
+      </w:r>
+    </w:p>
+    <w:p>
+      <w:pPr>
+        <w:spacing w:before="0" w:after="0" w:line="240" w:lineRule="auto"/>
+        <w:ind w:firstLine="0"/>
+        <w:jc w:val="both"/>
+      </w:pPr>
+      <w:r>
+        <w:rPr>
+          <w:sz w:val="20"/>
+        </w:rPr>
+        <w:t>where 𝒮</w:t>
+      </w:r>
+      <w:r>
+        <w:rPr>
+          <w:sz w:val="20"/>
+          <w:vertAlign w:val="subscript"/>
+        </w:rPr>
+        <w:t>i</w:t>
+      </w:r>
+      <w:r>
+        <w:rPr>
+          <w:sz w:val="20"/>
+        </w:rPr>
+        <w:t xml:space="preserve"> is the set of objects of class C</w:t>
+      </w:r>
+      <w:r>
+        <w:rPr>
+          <w:sz w:val="20"/>
+          <w:vertAlign w:val="subscript"/>
+        </w:rPr>
+        <w:t>i</w:t>
+      </w:r>
+      <w:r>
+        <w:rPr>
+          <w:sz w:val="20"/>
+        </w:rPr>
+        <w:t xml:space="preserve"> in states A, L, or M and ρ = 5. This rule hides a high-confidence misreading next to the true object while keeping two real objects of one class. On the office run, the map ends with eight active objects (14–29 observations each) and two hidden tentative ones.</w:t>
+      </w:r>
+    </w:p>
+    <w:p>
+      <w:pPr>
+        <w:keepNext/>
+        <w:spacing w:before="120" w:after="60" w:line="240" w:lineRule="auto"/>
+        <w:ind w:firstLine="0"/>
+        <w:jc w:val="left"/>
+      </w:pPr>
+      <w:r>
+        <w:rPr>
+          <w:b/>
+          <w:i/>
+          <w:sz w:val="20"/>
+        </w:rPr>
+        <w:t>5.2 | Loop-closure-aware update</w:t>
+      </w:r>
+    </w:p>
+    <w:p>
+      <w:pPr>
+        <w:spacing w:before="0" w:after="0" w:line="240" w:lineRule="auto"/>
+        <w:ind w:firstLine="0"/>
+        <w:jc w:val="both"/>
+      </w:pPr>
+      <w:r>
+        <w:rPr>
+          <w:sz w:val="20"/>
+        </w:rPr>
+        <w:t>When SLAM corrects its keyframes (Fig. 1, panel 6), the next keyframe list carries the corrected poses T′</w:t>
+      </w:r>
+      <w:r>
+        <w:rPr>
+          <w:sz w:val="20"/>
+          <w:vertAlign w:val="subscript"/>
+        </w:rPr>
+        <w:t>W←Ki</w:t>
+      </w:r>
+      <w:r>
+        <w:rPr>
+          <w:sz w:val="20"/>
+        </w:rPr>
+        <w:t>, and every object is updated by</w:t>
+      </w:r>
+    </w:p>
+    <w:p>
+      <w:pPr>
+        <w:tabs>
+          <w:tab w:pos="2324" w:val="center"/>
+          <w:tab w:pos="4649" w:val="right"/>
+        </w:tabs>
+        <w:spacing w:before="60" w:after="60" w:line="240" w:lineRule="auto"/>
+        <w:ind w:firstLine="0"/>
+        <w:jc w:val="left"/>
+      </w:pPr>
+      <w:r>
+        <w:rPr>
+          <w:rFonts w:ascii="Cambria Math" w:hAnsi="Cambria Math"/>
+          <w:i w:val="0"/>
+          <w:sz w:val="20"/>
+        </w:rPr>
+        <w:tab/>
+      </w:r>
+      <w:r>
+        <w:rPr>
+          <w:rFonts w:ascii="Cambria Math" w:hAnsi="Cambria Math"/>
+          <w:i w:val="0"/>
+          <w:sz w:val="20"/>
+        </w:rPr>
+        <w:t>T′</w:t>
+      </w:r>
+      <w:r>
+        <w:rPr>
+          <w:rFonts w:ascii="Cambria Math" w:hAnsi="Cambria Math"/>
+          <w:i w:val="0"/>
+          <w:sz w:val="20"/>
+          <w:vertAlign w:val="subscript"/>
+        </w:rPr>
+        <w:t>W←Oi</w:t>
+      </w:r>
+      <w:r>
+        <w:rPr>
+          <w:rFonts w:ascii="Cambria Math" w:hAnsi="Cambria Math"/>
+          <w:i w:val="0"/>
+          <w:sz w:val="20"/>
+        </w:rPr>
+        <w:t xml:space="preserve"> = T′</w:t>
+      </w:r>
+      <w:r>
+        <w:rPr>
+          <w:rFonts w:ascii="Cambria Math" w:hAnsi="Cambria Math"/>
+          <w:i w:val="0"/>
+          <w:sz w:val="20"/>
+          <w:vertAlign w:val="subscript"/>
+        </w:rPr>
+        <w:t>W←Ki</w:t>
+      </w:r>
+      <w:r>
+        <w:rPr>
+          <w:rFonts w:ascii="Cambria Math" w:hAnsi="Cambria Math"/>
+          <w:i w:val="0"/>
+          <w:sz w:val="20"/>
+        </w:rPr>
+        <w:t xml:space="preserve"> · T</w:t>
+      </w:r>
+      <w:r>
+        <w:rPr>
+          <w:rFonts w:ascii="Cambria Math" w:hAnsi="Cambria Math"/>
+          <w:i w:val="0"/>
+          <w:sz w:val="20"/>
+          <w:vertAlign w:val="subscript"/>
+        </w:rPr>
+        <w:t>Ki←Oi</w:t>
+      </w:r>
+      <w:r>
+        <w:rPr>
+          <w:sz w:val="20"/>
+        </w:rPr>
+        <w:tab/>
+        <w:t>(13)</w:t>
+      </w:r>
+    </w:p>
+    <w:p>
+      <w:pPr>
+        <w:spacing w:before="0" w:after="0" w:line="240" w:lineRule="auto"/>
+        <w:ind w:firstLine="0"/>
+        <w:jc w:val="both"/>
+      </w:pPr>
+      <w:r>
+        <w:rPr>
+          <w:sz w:val="20"/>
+        </w:rPr>
         <w:t>Only keyframe poses change; T</w:t>
       </w:r>
       <w:r>
@@ -2097,26 +2946,13 @@
           <w:sz w:val="20"/>
           <w:vertAlign w:val="subscript"/>
         </w:rPr>
-        <w:t>K_{i</w:t>
-      </w:r>
-      <w:r>
-        <w:rPr>
-          <w:sz w:val="20"/>
-        </w:rPr>
-        <w:t>←O</w:t>
-      </w:r>
-      <w:r>
-        <w:rPr>
-          <w:sz w:val="20"/>
-          <w:vertAlign w:val="subscript"/>
-        </w:rPr>
-        <w:t>i</w:t>
-      </w:r>
-      <w:r>
-        <w:rPr>
-          <w:sz w:val="20"/>
-        </w:rPr>
-        <w:t>} is never modified, so all objects anchored to a keyframe move with it. An object whose keyframe was culled is re-anchored to the nearest live keyframe of the previous list, and the map can be rebuilt from the observation history whenever keyframe poses change (75 ms for 308 frames). For display, all map objects are projected at 15 Hz into a buffered image with the SLAM pose of that image's time, so drawing is independent of the recognition rate.</w:t>
+        <w:t>Ki←Oi</w:t>
+      </w:r>
+      <w:r>
+        <w:rPr>
+          <w:sz w:val="20"/>
+        </w:rPr>
+        <w:t xml:space="preserve"> is never modified, so all objects anchored to a keyframe move with it. An object whose keyframe was culled is re-anchored to the nearest live keyframe of the previous list, and the map can be rebuilt from the observation history whenever keyframe poses change (75 ms for 308 frames). For display, all map objects are projected at 15 Hz into a buffered image with the SLAM pose of that image's time, so drawing is independent of the recognition rate.</w:t>
       </w:r>
     </w:p>
     <w:p>

</xml_diff>